<commit_message>
Reword 4ב and 4ג so the questions ask for what the rubric awards; rebuild Form A test and key
Co-Authored-By: Claude Sonnet 5.5 <noreply@anthropic.com>
</commit_message>
<xml_diff>
--- a/units/u2-turtle-graphics/u2-turtle-test-a-students-he.docx
+++ b/units/u2-turtle-graphics/u2-turtle-test-a-students-he.docx
@@ -7977,7 +7977,7 @@
           <w:szCs w:val="22"/>
           <w:rtl/>
         </w:rPr>
-        <w:t xml:space="preserve">הקוד הבא אמור לצייר ריבוע עם צלע 100, אבל הוא לא מצייר ריבוע. מה חסר בקוד, ואיפה צריך להוסיף את זה? (הצב מתחיל במצב ההתחלתי)</w:t>
+        <w:t xml:space="preserve">הקוד הבא אמור לצייר ריבוע עם צלע 100, אבל הוא לא מצייר ריבוע. מה חסר בקוד, ואיפה צריך להוסיף את זה, ומה קורה בציור בגלל החסר? (הצב מתחיל במצב ההתחלתי)</w:t>
       </w:r>
       <w:r>
         <w:rPr>
@@ -9674,7 +9674,7 @@
           <w:szCs w:val="22"/>
           <w:rtl/>
         </w:rPr>
-        <w:t xml:space="preserve">? (הצב מתחיל במצב ההתחלתי)</w:t>
+        <w:t xml:space="preserve">? ציינו גם מה נשאר זהה. (הצב מתחיל במצב ההתחלתי)</w:t>
       </w:r>
       <w:r>
         <w:rPr>

</xml_diff>